<commit_message>
Tie ADR-02/06 to A2 ASRs; improve telemetry diagrams and report layout
- ADR-02 cites ASR22, ASR3 and the scalability rationale; marks rate-limiting unbuilt
- ADR-06 cites ASR15, ASR16, C2; two prior schema versions kept
- Component view: separate Irrigation and Alerts and AI Recommendation boxes, larger text
- Runtime view: opt fragment, separate replay messages, larger text
- Report: student number, figure numbers, path-only GET URL
</commit_message>
<xml_diff>
--- a/docs/Aditya_A4_Report_Section.docx
+++ b/docs/Aditya_A4_Report_Section.docx
@@ -29,7 +29,7 @@
           <w:sz w:val="22"/>
           <w:szCs w:val="22"/>
         </w:rPr>
-        <w:t xml:space="preserve">Aditya Singh | ISYS3459 Assignment 4 | 24 October 2026</w:t>
+        <w:t xml:space="preserve">Aditya Singh (s4139812) | ISYS3459 Assignment 4 | 24 October 2026</w:t>
       </w:r>
     </w:p>
     <w:p>
@@ -74,7 +74,7 @@
           <w:sz w:val="21"/>
           <w:szCs w:val="21"/>
         </w:rPr>
-        <w:t xml:space="preserve">The submitted Assignment 2 report lists Scalability among its top driving characteristics: the platform must grow from 5,000 to over 50,000 farms with tenfold seasonal telemetry spikes. ASR1 targets ingestion below two seconds, ASR5 requires suspicious readings not to trigger automated actions, ASR16 requires versioned APIs, constraint C3 requires 72-hour offline edge operation and C4 limits operations to at most eight engineers. ADR-01 places telemetry in its own Telemetry service, which owns the Telemetry Store and publishes accepted readings through the Event Broker.</w:t>
+        <w:t xml:space="preserve">The submitted Assignment 2 report names Scalability and Interoperability among its top three driving characteristics: the platform must grow from 5,000 to 50,000 farms with sub-second ingestion and accept LoRaWAN, NB-IoT and other sensor networks without rebuilding core services. ASR22 requires absorbing tenfold seasonal spikes without data loss, ASR3 requires 72-hour edge buffering with resync within 15 minutes, ASR5 requires anomalous readings not to trigger automated actions, ASR15 and ASR16 require adapter-based onboarding and versioned APIs, and C4 limits operations to at most eight engineers. ADR-01 places telemetry in its own Telemetry service, which owns the Telemetry Store and publishes accepted readings through the Event Broker.</w:t>
       </w:r>
     </w:p>
     <w:p>
@@ -938,7 +938,7 @@
                 <w:sz w:val="18"/>
                 <w:szCs w:val="18"/>
               </w:rPr>
-              <w:t xml:space="preserve">Scalability is a driving QA: OzAgriMate must grow from 5,000 to over 50,000 farms, and seasonal events can multiply telemetry tenfold. ASR1 targets ingestion below two seconds, and C3 means gateways replay up to 72 hours of buffered readings after outages. Alternatives: synchronous fan-out, where ingestion calls irrigation, alerts and AI before responding, ties ingestion latency and capacity to every consumer; one vertically scaled database caps growth and creates a hot spot; per-farm deployments are unmanageable for at most eight engineers (C4). Replay storms must not crowd out live readings.</w:t>
+              <w:t xml:space="preserve">Scalability is the top driving QA: OzAgriMate must grow from 5,000 to 50,000 farms with sub-second ingestion. ASR22 requires absorbing tenfold planting and harvest spikes without data loss; ASR3 requires gateways to resync 72 hours of buffered readings within 15 minutes; C4 limits operations to eight engineers. Alternatives: synchronous fan-out to irrigation, alerts and AI ties ingestion latency to every consumer; one vertically scaled database caps growth; per-farm deployments are unmanageable. Replay bursts must not starve live readings.</w:t>
             </w:r>
           </w:p>
         </w:tc>
@@ -1003,7 +1003,7 @@
                 <w:sz w:val="18"/>
                 <w:szCs w:val="18"/>
               </w:rPr>
-              <w:t xml:space="preserve">Run Telemetry as stateless, horizontally scaled instances, autoscaled on request rate and broker lag. Acknowledge a reading once stored, then publish a ReadingAccepted event through an outbox to the managed broker, partitioned by farmId, so consumers scale independently. Partition the time-series store by farm and observation time; every query is farm-scoped and capped at 500 rows. Idempotent reading IDs make replay retries safe, and replay traffic is rate-limited below live traffic. The prototype implements farm partitions, bounded queries, idempotent ingestion and the outbox; autoscaling and the broker are not deployed.</w:t>
+              <w:t xml:space="preserve">Run Telemetry as stateless, horizontally scaled instances, autoscaled on request rate and broker lag. Acknowledge a reading once stored, then publish a ReadingAccepted event through an outbox to the managed broker, partitioned by farmId, so consumers scale independently. Partition the time-series store by farm and time; queries are farm-scoped and capped at 500 rows. Idempotent reading IDs make replays safe; replay traffic is rate-limited below live traffic. Prototype: partitions, bounded queries, idempotency and outbox only; autoscaling, broker and rate-limiting are not built.</w:t>
             </w:r>
           </w:p>
         </w:tc>
@@ -1133,7 +1133,7 @@
                 <w:sz w:val="18"/>
                 <w:szCs w:val="18"/>
               </w:rPr>
-              <w:t xml:space="preserve">Load-test 50,000 simulated farms at tenfold peak with 72-hour replay: p95 acknowledgement under one second, zero lost readings. Alert when consumer lag exceeds 60 seconds.</w:t>
+              <w:t xml:space="preserve">Load-test 50,000 simulated farms at tenfold peak plus 72-hour replay: p95 acknowledgement under one second, zero lost readings, resync within 15 minutes.</w:t>
             </w:r>
           </w:p>
         </w:tc>
@@ -1161,7 +1161,7 @@
           <w:sz w:val="19"/>
           <w:szCs w:val="19"/>
         </w:rPr>
-        <w:t xml:space="preserve">Scalability driving QA (5,000 to 50,000+ farms; tenfold seasonal spikes); ASR1; constraints C3 and C4; supports Elasticity. Builds on ADR-01 asynchronous telemetry processing; quarantined readings are never published (ASR5, ADR-03).</w:t>
+        <w:t xml:space="preserve">Scalability (top-three driving QA) and Elasticity; ASR22, ASR3, ASR1; risk R2 (10x load testing); constraints C3 and C4. Refines ADR-01's asynchronous telemetry processing into concrete scaling mechanisms; quarantined readings are never published (ASR5, ADR-03).</w:t>
       </w:r>
     </w:p>
     <w:p>
@@ -1454,7 +1454,7 @@
                 <w:sz w:val="18"/>
                 <w:szCs w:val="18"/>
               </w:rPr>
-              <w:t xml:space="preserve">Farms use heterogeneous sensors and field protocols such as LoRaWAN, NB-IoT, ISOBUS and vendor JSON, and rural links drop often. Telemetry needs one stable input it can validate, and gateways must resend buffered readings safely after outages (C3). ASR16 requires versioned APIs. Alternatives: accepting every vendor format in the cloud spreads protocol logic into Telemetry and changes it whenever hardware changes; devices publishing MQTT directly to a cloud broker need per-device credentials at large scale and bypass central validation; binary formats such as Protocol Buffers save bandwidth but are harder for partners to adopt and test.</w:t>
+              <w:t xml:space="preserve">Interoperability is a top driving QA: farms use LoRaWAN, NB-IoT, ISOBUS/ADAPT and vendor sensors over constrained, unreliable links (C2). ASR15 requires onboarding device types without changing ingestion; ASR16 requires versioned, backward-compatible APIs; gateways must resend buffered readings safely (ASR3, C3). Alternatives: accepting every vendor format in the cloud spreads protocol logic into Telemetry and changes it whenever hardware changes; devices publishing MQTT directly to a cloud broker need per-device credentials at scale and bypass central validation; binary formats such as Protocol Buffers save bandwidth but are harder for partners to adopt and test.</w:t>
             </w:r>
           </w:p>
         </w:tc>
@@ -1519,7 +1519,7 @@
                 <w:sz w:val="18"/>
                 <w:szCs w:val="18"/>
               </w:rPr>
-              <w:t xml:space="preserve">Gateways translate field protocols locally and POST one canonical JSON reading per request to /farms/{farmId}/telemetry over HTTPS with a farm-bound machine credential. Each reading carries schemaVersion, a stable gateway-assigned readingId, deviceId, paddockId, metric, value, canonical unit and UTC observedAt. Telemetry rejects unknown versions, extra fields and unit mismatches with 422, returns 201 for new readings, 200 for identical replays and 409 for conflicting reuse. ReadingAccepted events reuse these fields. New schema versions are added alongside old ones, never changed in place.</w:t>
+              <w:t xml:space="preserve">Gateways translate field protocols locally and POST one canonical JSON reading per request to /farms/{farmId}/telemetry over HTTPS with a farm-bound machine credential. Each reading carries schemaVersion, a stable gateway-assigned readingId, deviceId, paddockId, metric, value, canonical unit and UTC observedAt. Telemetry rejects unknown versions, extra fields and unit mismatches with 422, returns 201 for new readings, 200 for identical replays and 409 for conflicting reuse. ReadingAccepted events reuse these fields. New schema versions are added alongside the two previous versions (ASR16), never changed in place.</w:t>
             </w:r>
           </w:p>
         </w:tc>
@@ -1677,7 +1677,7 @@
           <w:sz w:val="19"/>
           <w:szCs w:val="19"/>
         </w:rPr>
-        <w:t xml:space="preserve">ASR5, ASR16; constraint C3; Interoperability and Scalability QAs. Event fields satisfy the team integration contract (stable reading ID, farm ID, device ID, UTC time, metric, value, unit, schema version). Enables ADR-02 idempotent replay.</w:t>
+        <w:t xml:space="preserve">Interoperability (top-three driving QA); ASR1, ASR3, ASR5, ASR15, ASR16; constraints C2 and C3. Event fields satisfy the team integration contract (stable reading ID, farm ID, device ID, UTC time, metric, value, unit, schema version). Enables ADR-02 idempotent replay; complements ADR-04.</w:t>
       </w:r>
     </w:p>
     <w:p>
@@ -1711,7 +1711,7 @@
           <w:sz w:val="19"/>
           <w:szCs w:val="19"/>
         </w:rPr>
-        <w:t xml:space="preserve">OzAgriMate Telemetry C4 Component Diagram</w:t>
+        <w:t xml:space="preserve">Figure 5 OzAgriMate Telemetry C4 Component Diagram</w:t>
       </w:r>
     </w:p>
     <w:p>
@@ -1721,7 +1721,7 @@
       <w:r>
         <w:drawing>
           <wp:inline distT="0" distB="0" distL="0" distR="0">
-            <wp:extent cx="5334000" cy="4733925"/>
+            <wp:extent cx="6115050" cy="5448300"/>
             <wp:effectExtent t="0" r="0" b="0" l="0"/>
             <wp:docPr id="1" name="diagrams/Telemetry_Components.png" descr="diagrams/Telemetry_Components.png" title="diagrams/Telemetry_Components.png"/>
             <wp:cNvGraphicFramePr>
@@ -1746,7 +1746,7 @@
                   <pic:spPr bwMode="auto">
                     <a:xfrm>
                       <a:off x="0" y="0"/>
-                      <a:ext cx="5334000" cy="4733925"/>
+                      <a:ext cx="6115050" cy="5448300"/>
                     </a:xfrm>
                     <a:prstGeom prst="rect">
                       <a:avLst/>
@@ -2880,7 +2880,7 @@
           <w:sz w:val="19"/>
           <w:szCs w:val="19"/>
         </w:rPr>
-        <w:t xml:space="preserve">OzAgriMate Runtime Diagram 1: telemetry submission and processing (UML sequence)</w:t>
+        <w:t xml:space="preserve">Figure 6 OzAgriMate Runtime Diagram 1: telemetry submission and processing (UML sequence)</w:t>
       </w:r>
     </w:p>
     <w:p>
@@ -2915,7 +2915,7 @@
       <w:r>
         <w:drawing>
           <wp:inline distT="0" distB="0" distL="0" distR="0">
-            <wp:extent cx="6667500" cy="5067300"/>
+            <wp:extent cx="6810375" cy="5695950"/>
             <wp:effectExtent t="0" r="0" b="0" l="0"/>
             <wp:docPr id="2" name="diagrams/Telemetry_Runtime.png" descr="diagrams/Telemetry_Runtime.png" title="diagrams/Telemetry_Runtime.png"/>
             <wp:cNvGraphicFramePr>
@@ -2940,7 +2940,7 @@
                   <pic:spPr bwMode="auto">
                     <a:xfrm>
                       <a:off x="0" y="0"/>
-                      <a:ext cx="6667500" cy="5067300"/>
+                      <a:ext cx="6810375" cy="5695950"/>
                     </a:xfrm>
                     <a:prstGeom prst="rect">
                       <a:avLst/>
@@ -2958,7 +2958,7 @@
         <w:sectPr>
           <w:footerReference w:type="default" r:id="rId7"/>
           <w:pgSz w:w="16838" w:h="11906" w:orient="landscape"/>
-          <w:pgMar w:top="700" w:right="1000" w:bottom="700" w:left="1000" w:header="708" w:footer="708" w:gutter="0"/>
+          <w:pgMar w:top="500" w:right="700" w:bottom="500" w:left="700" w:header="708" w:footer="708" w:gutter="0"/>
           <w:pgNumType/>
           <w:docGrid w:linePitch="360"/>
         </w:sectPr>
@@ -3965,7 +3965,7 @@
                 <w:sz w:val="18"/>
                 <w:szCs w:val="18"/>
               </w:rPr>
-              <w:t xml:space="preserve">/farms/{farmId}/telemetry?metric=soilMoisture&amp;from=2026-10-23T20:30:00Z</w:t>
+              <w:t xml:space="preserve">/farms/{farmId}/telemetry</w:t>
             </w:r>
           </w:p>
         </w:tc>
@@ -4525,6 +4525,20 @@
         </w:tc>
       </w:tr>
     </w:tbl>
+    <w:p>
+      <w:pPr>
+        <w:spacing w:after="120" w:before="80"/>
+      </w:pPr>
+      <w:r>
+        <w:rPr>
+          <w:rFonts w:ascii="Calibri" w:cs="Calibri" w:eastAsia="Calibri" w:hAnsi="Calibri"/>
+          <w:color w:val="183047"/>
+          <w:sz w:val="21"/>
+          <w:szCs w:val="21"/>
+        </w:rPr>
+        <w:t xml:space="preserve">Sample response is for GET /farms/farm-001/telemetry?metric=soilMoisture&amp;from=2026-10-23T20:30:00Z; all query parameters are optional.</w:t>
+      </w:r>
+    </w:p>
     <w:p>
       <w:pPr>
         <w:spacing w:after="120" w:before="120"/>
@@ -6876,7 +6890,7 @@
         <w:sz w:val="17"/>
         <w:szCs w:val="17"/>
       </w:rPr>
-      <w:t xml:space="preserve">Aditya Singh | page </w:t>
+      <w:t xml:space="preserve">Aditya Singh (s4139812) | page </w:t>
     </w:r>
     <w:r>
       <w:rPr>
@@ -6906,7 +6920,7 @@
         <w:sz w:val="17"/>
         <w:szCs w:val="17"/>
       </w:rPr>
-      <w:t xml:space="preserve">Aditya Singh | page </w:t>
+      <w:t xml:space="preserve">Aditya Singh (s4139812) | page </w:t>
     </w:r>
     <w:r>
       <w:rPr>
@@ -6936,7 +6950,7 @@
         <w:sz w:val="17"/>
         <w:szCs w:val="17"/>
       </w:rPr>
-      <w:t xml:space="preserve">Aditya Singh | page </w:t>
+      <w:t xml:space="preserve">Aditya Singh (s4139812) | page </w:t>
     </w:r>
     <w:r>
       <w:rPr>

</xml_diff>